<commit_message>
Add GARP study specifics to the selection brief
Section 4 carried only the qualitative claim. Replaced it with the
study's actual design and figures:

- Full citation: Paisley and Nelson, GARP Risk Institute, for the
  Climate Financial Risk Forum, October 2025
- Design: 13 vendors assessed anonymously against the same 100
  properties in the UK, mainland Europe, the US and Asia
- Findings table: flood damage-ratio correlation of 0.2 to 0.9, and a
  0.7C warming spread by 2025 widening to 3.2-5.7C by 2100 under a
  shared RCP 8.5 scenario
- GARP's conclusion that no vendor is the best one

The warming spread matters most: identical scenario in, 2.5C apart by
2100, so divergence begins at the climate input rather than at the
property.

Co-Authored-By: Claude Opus 5 <noreply@anthropic.com>
Claude-Session: https://claude.ai/code/session_014dPvFQvES9ddXTwH3cNDvE
</commit_message>
<xml_diff>
--- a/docs/ai-engine-selection-climate-risk.docx
+++ b/docs/ai-engine-selection-climate-risk.docx
@@ -1541,7 +1541,361 @@
           <w:sz w:val="22"/>
           <w:szCs w:val="22"/>
         </w:rPr>
-        <w:t xml:space="preserve">The Global Association of Risk Professionals benchmarked 13 physical risk vendors on the same assets. The spread was wide across both hazard estimates and the damages attached to them. A single property could be rated highly exposed to flooding by one vendor and not exposed at all by another. GARP attributes it to a complexity cascade: modelling choices compound across weather, hydrology, hydraulics, damage functions and scenarios.</w:t>
+        <w:t xml:space="preserve">The GARP Risk Institute ran the benchmark that makes the point. Jo Paisley and Maxine Nelson assessed 13 physical risk vendors anonymously for the Financial Resilience Working Group of the UK's Climate Financial Risk Forum, published October 2025 as A Risk Professional's Guide to Physical Risk Assessments. Every vendor received the same 100 properties across the UK, mainland Europe, the US and Asia.</w:t>
+      </w:r>
+    </w:p>
+    <w:tbl>
+      <w:tblPr>
+        <w:tblW w:type="dxa" w:w="9360"/>
+        <w:tblBorders>
+          <w:top w:val="single" w:color="C9D6D1" w:sz="4"/>
+          <w:left w:val="single" w:color="C9D6D1" w:sz="4"/>
+          <w:bottom w:val="single" w:color="C9D6D1" w:sz="4"/>
+          <w:right w:val="single" w:color="C9D6D1" w:sz="4"/>
+          <w:insideH w:val="single" w:color="C9D6D1" w:sz="4"/>
+          <w:insideV w:val="single" w:color="C9D6D1" w:sz="4"/>
+        </w:tblBorders>
+      </w:tblPr>
+      <w:tblGrid>
+        <w:gridCol w:w="3400"/>
+        <w:gridCol w:w="5960"/>
+      </w:tblGrid>
+      <w:tr>
+        <w:trPr>
+          <w:tblHeader/>
+        </w:trPr>
+        <w:tc>
+          <w:tcPr>
+            <w:tcW w:type="dxa" w:w="3400"/>
+            <w:shd w:fill="EAF1EE" w:val="clear"/>
+            <w:tcMar>
+              <w:top w:type="dxa" w:w="90"/>
+              <w:left w:type="dxa" w:w="120"/>
+              <w:bottom w:type="dxa" w:w="90"/>
+              <w:right w:type="dxa" w:w="120"/>
+            </w:tcMar>
+          </w:tcPr>
+          <w:p>
+            <w:pPr>
+              <w:spacing w:after="0" w:line="252"/>
+            </w:pPr>
+            <w:r>
+              <w:rPr>
+                <w:b/>
+                <w:bCs/>
+                <w:color w:val="144035"/>
+                <w:sz w:val="18"/>
+                <w:szCs w:val="18"/>
+              </w:rPr>
+              <w:t xml:space="preserve">Measure</w:t>
+            </w:r>
+          </w:p>
+        </w:tc>
+        <w:tc>
+          <w:tcPr>
+            <w:tcW w:type="dxa" w:w="5960"/>
+            <w:shd w:fill="EAF1EE" w:val="clear"/>
+            <w:tcMar>
+              <w:top w:type="dxa" w:w="90"/>
+              <w:left w:type="dxa" w:w="120"/>
+              <w:bottom w:type="dxa" w:w="90"/>
+              <w:right w:type="dxa" w:w="120"/>
+            </w:tcMar>
+          </w:tcPr>
+          <w:p>
+            <w:pPr>
+              <w:spacing w:after="0" w:line="252"/>
+            </w:pPr>
+            <w:r>
+              <w:rPr>
+                <w:b/>
+                <w:bCs/>
+                <w:color w:val="144035"/>
+                <w:sz w:val="18"/>
+                <w:szCs w:val="18"/>
+              </w:rPr>
+              <w:t xml:space="preserve">What the study found</w:t>
+            </w:r>
+          </w:p>
+        </w:tc>
+      </w:tr>
+      <w:tr>
+        <w:tc>
+          <w:tcPr>
+            <w:tcW w:type="dxa" w:w="3400"/>
+            <w:shd w:fill="FFFFFF" w:val="clear"/>
+            <w:tcMar>
+              <w:top w:type="dxa" w:w="90"/>
+              <w:left w:type="dxa" w:w="120"/>
+              <w:bottom w:type="dxa" w:w="90"/>
+              <w:right w:type="dxa" w:w="120"/>
+            </w:tcMar>
+          </w:tcPr>
+          <w:p>
+            <w:pPr>
+              <w:spacing w:after="0" w:line="252"/>
+            </w:pPr>
+            <w:r>
+              <w:rPr>
+                <w:color w:val="1A1A1A"/>
+                <w:sz w:val="18"/>
+                <w:szCs w:val="18"/>
+              </w:rPr>
+              <w:t xml:space="preserve">Flood damage-ratio correlation between vendors</w:t>
+            </w:r>
+          </w:p>
+        </w:tc>
+        <w:tc>
+          <w:tcPr>
+            <w:tcW w:type="dxa" w:w="5960"/>
+            <w:shd w:fill="FFFFFF" w:val="clear"/>
+            <w:tcMar>
+              <w:top w:type="dxa" w:w="90"/>
+              <w:left w:type="dxa" w:w="120"/>
+              <w:bottom w:type="dxa" w:w="90"/>
+              <w:right w:type="dxa" w:w="120"/>
+            </w:tcMar>
+          </w:tcPr>
+          <w:p>
+            <w:pPr>
+              <w:spacing w:after="0" w:line="252"/>
+            </w:pPr>
+            <w:r>
+              <w:rPr>
+                <w:color w:val="1A1A1A"/>
+                <w:sz w:val="18"/>
+                <w:szCs w:val="18"/>
+              </w:rPr>
+              <w:t xml:space="preserve">Ranged from 0.2 to 0.9</w:t>
+            </w:r>
+          </w:p>
+        </w:tc>
+      </w:tr>
+      <w:tr>
+        <w:tc>
+          <w:tcPr>
+            <w:tcW w:type="dxa" w:w="3400"/>
+            <w:shd w:fill="F7FAF9" w:val="clear"/>
+            <w:tcMar>
+              <w:top w:type="dxa" w:w="90"/>
+              <w:left w:type="dxa" w:w="120"/>
+              <w:bottom w:type="dxa" w:w="90"/>
+              <w:right w:type="dxa" w:w="120"/>
+            </w:tcMar>
+          </w:tcPr>
+          <w:p>
+            <w:pPr>
+              <w:spacing w:after="0" w:line="252"/>
+            </w:pPr>
+            <w:r>
+              <w:rPr>
+                <w:color w:val="1A1A1A"/>
+                <w:sz w:val="18"/>
+                <w:szCs w:val="18"/>
+              </w:rPr>
+              <w:t xml:space="preserve">Warming under the same RCP 8.5 scenario</w:t>
+            </w:r>
+          </w:p>
+        </w:tc>
+        <w:tc>
+          <w:tcPr>
+            <w:tcW w:type="dxa" w:w="5960"/>
+            <w:shd w:fill="F7FAF9" w:val="clear"/>
+            <w:tcMar>
+              <w:top w:type="dxa" w:w="90"/>
+              <w:left w:type="dxa" w:w="120"/>
+              <w:bottom w:type="dxa" w:w="90"/>
+              <w:right w:type="dxa" w:w="120"/>
+            </w:tcMar>
+          </w:tcPr>
+          <w:p>
+            <w:pPr>
+              <w:spacing w:after="0" w:line="252"/>
+            </w:pPr>
+            <w:r>
+              <w:rPr>
+                <w:color w:val="1A1A1A"/>
+                <w:sz w:val="18"/>
+                <w:szCs w:val="18"/>
+              </w:rPr>
+              <w:t xml:space="preserve">0.7°C spread by 2025, widening to 3.2–5.7°C by 2100</w:t>
+            </w:r>
+          </w:p>
+        </w:tc>
+      </w:tr>
+      <w:tr>
+        <w:tc>
+          <w:tcPr>
+            <w:tcW w:type="dxa" w:w="3400"/>
+            <w:shd w:fill="FFFFFF" w:val="clear"/>
+            <w:tcMar>
+              <w:top w:type="dxa" w:w="90"/>
+              <w:left w:type="dxa" w:w="120"/>
+              <w:bottom w:type="dxa" w:w="90"/>
+              <w:right w:type="dxa" w:w="120"/>
+            </w:tcMar>
+          </w:tcPr>
+          <w:p>
+            <w:pPr>
+              <w:spacing w:after="0" w:line="252"/>
+            </w:pPr>
+            <w:r>
+              <w:rPr>
+                <w:color w:val="1A1A1A"/>
+                <w:sz w:val="18"/>
+                <w:szCs w:val="18"/>
+              </w:rPr>
+              <w:t xml:space="preserve">Hazard exposure</w:t>
+            </w:r>
+          </w:p>
+        </w:tc>
+        <w:tc>
+          <w:tcPr>
+            <w:tcW w:type="dxa" w:w="5960"/>
+            <w:shd w:fill="FFFFFF" w:val="clear"/>
+            <w:tcMar>
+              <w:top w:type="dxa" w:w="90"/>
+              <w:left w:type="dxa" w:w="120"/>
+              <w:bottom w:type="dxa" w:w="90"/>
+              <w:right w:type="dxa" w:w="120"/>
+            </w:tcMar>
+          </w:tcPr>
+          <w:p>
+            <w:pPr>
+              <w:spacing w:after="0" w:line="252"/>
+            </w:pPr>
+            <w:r>
+              <w:rPr>
+                <w:color w:val="1A1A1A"/>
+                <w:sz w:val="18"/>
+                <w:szCs w:val="18"/>
+              </w:rPr>
+              <w:t xml:space="preserve">The same property rated highly exposed by some vendors and not exposed at all by others</w:t>
+            </w:r>
+          </w:p>
+        </w:tc>
+      </w:tr>
+      <w:tr>
+        <w:tc>
+          <w:tcPr>
+            <w:tcW w:type="dxa" w:w="3400"/>
+            <w:shd w:fill="F7FAF9" w:val="clear"/>
+            <w:tcMar>
+              <w:top w:type="dxa" w:w="90"/>
+              <w:left w:type="dxa" w:w="120"/>
+              <w:bottom w:type="dxa" w:w="90"/>
+              <w:right w:type="dxa" w:w="120"/>
+            </w:tcMar>
+          </w:tcPr>
+          <w:p>
+            <w:pPr>
+              <w:spacing w:after="0" w:line="252"/>
+            </w:pPr>
+            <w:r>
+              <w:rPr>
+                <w:color w:val="1A1A1A"/>
+                <w:sz w:val="18"/>
+                <w:szCs w:val="18"/>
+              </w:rPr>
+              <w:t xml:space="preserve">Damage ratios</w:t>
+            </w:r>
+          </w:p>
+        </w:tc>
+        <w:tc>
+          <w:tcPr>
+            <w:tcW w:type="dxa" w:w="5960"/>
+            <w:shd w:fill="F7FAF9" w:val="clear"/>
+            <w:tcMar>
+              <w:top w:type="dxa" w:w="90"/>
+              <w:left w:type="dxa" w:w="120"/>
+              <w:bottom w:type="dxa" w:w="90"/>
+              <w:right w:type="dxa" w:w="120"/>
+            </w:tcMar>
+          </w:tcPr>
+          <w:p>
+            <w:pPr>
+              <w:spacing w:after="0" w:line="252"/>
+            </w:pPr>
+            <w:r>
+              <w:rPr>
+                <w:color w:val="1A1A1A"/>
+                <w:sz w:val="18"/>
+                <w:szCs w:val="18"/>
+              </w:rPr>
+              <w:t xml:space="preserve">Dispersion across every peril tested: coastal flood, cyclone, windstorm and heat</w:t>
+            </w:r>
+          </w:p>
+        </w:tc>
+      </w:tr>
+      <w:tr>
+        <w:tc>
+          <w:tcPr>
+            <w:tcW w:type="dxa" w:w="3400"/>
+            <w:shd w:fill="FFFFFF" w:val="clear"/>
+            <w:tcMar>
+              <w:top w:type="dxa" w:w="90"/>
+              <w:left w:type="dxa" w:w="120"/>
+              <w:bottom w:type="dxa" w:w="90"/>
+              <w:right w:type="dxa" w:w="120"/>
+            </w:tcMar>
+          </w:tcPr>
+          <w:p>
+            <w:pPr>
+              <w:spacing w:after="0" w:line="252"/>
+            </w:pPr>
+            <w:r>
+              <w:rPr>
+                <w:color w:val="1A1A1A"/>
+                <w:sz w:val="18"/>
+                <w:szCs w:val="18"/>
+              </w:rPr>
+              <w:t xml:space="preserve">Hazard to damage relationship</w:t>
+            </w:r>
+          </w:p>
+        </w:tc>
+        <w:tc>
+          <w:tcPr>
+            <w:tcW w:type="dxa" w:w="5960"/>
+            <w:shd w:fill="FFFFFF" w:val="clear"/>
+            <w:tcMar>
+              <w:top w:type="dxa" w:w="90"/>
+              <w:left w:type="dxa" w:w="120"/>
+              <w:bottom w:type="dxa" w:w="90"/>
+              <w:right w:type="dxa" w:w="120"/>
+            </w:tcMar>
+          </w:tcPr>
+          <w:p>
+            <w:pPr>
+              <w:spacing w:after="0" w:line="252"/>
+            </w:pPr>
+            <w:r>
+              <w:rPr>
+                <w:color w:val="1A1A1A"/>
+                <w:sz w:val="18"/>
+                <w:szCs w:val="18"/>
+              </w:rPr>
+              <w:t xml:space="preserve">Sensible across vendor means, but extremely variable vendor by vendor</w:t>
+            </w:r>
+          </w:p>
+        </w:tc>
+      </w:tr>
+    </w:tbl>
+    <w:p>
+      <w:pPr>
+        <w:spacing w:after="140"/>
+      </w:pPr>
+    </w:p>
+    <w:p>
+      <w:pPr>
+        <w:spacing w:after="120" w:line="276"/>
+      </w:pPr>
+      <w:r>
+        <w:rPr>
+          <w:color w:val="1A1A1A"/>
+          <w:sz w:val="22"/>
+          <w:szCs w:val="22"/>
+        </w:rPr>
+        <w:t xml:space="preserve">The warming figure is the one worth showing a client. These vendors were handed an identical scenario and still landed roughly 2.5°C apart by 2100, so the divergence does not start at the property. It starts at the climate input and compounds downward. GARP calls this the complexity cascade: modelling choices stack across weather, hydrology, hydraulics, damage functions and scenarios.</w:t>
       </w:r>
     </w:p>
     <w:p>
@@ -1572,7 +1926,7 @@
           <w:sz w:val="21"/>
           <w:szCs w:val="21"/>
         </w:rPr>
-        <w:t xml:space="preserve">The practical consequence: no vendor is the accurate one. Treat a single-vendor number as an opinion, not a measurement.</w:t>
+        <w:t xml:space="preserve">GARP's own conclusion is blunt: there is no best vendor. Suitability depends on the use case and the data quality behind it. Treat any single-vendor number as an opinion, not a measurement.</w:t>
       </w:r>
     </w:p>
     <w:p>

</xml_diff>